<commit_message>
added big data rp
</commit_message>
<xml_diff>
--- a/SEM2/On Job Training/Ahmed OJT Content.docx
+++ b/SEM2/On Job Training/Ahmed OJT Content.docx
@@ -133,10 +133,10 @@
           <w:sz w:val="20"/>
         </w:rPr>
         <w:drawing>
-          <wp:inline distT="0" distB="0" distL="0" distR="0" wp14:anchorId="51404005" wp14:editId="7A17686E">
+          <wp:inline distT="0" distB="0" distL="0" distR="0" wp14:anchorId="771BCC05" wp14:editId="23886D5B">
             <wp:extent cx="6033135" cy="8533765"/>
             <wp:effectExtent l="0" t="0" r="5715" b="635"/>
-            <wp:docPr id="1315191072" name="Picture 15"/>
+            <wp:docPr id="546619094" name="Picture 7"/>
             <wp:cNvGraphicFramePr>
               <a:graphicFrameLocks xmlns:a="http://schemas.openxmlformats.org/drawingml/2006/main" noChangeAspect="1"/>
             </wp:cNvGraphicFramePr>
@@ -144,7 +144,7 @@
               <a:graphicData uri="http://schemas.openxmlformats.org/drawingml/2006/picture">
                 <pic:pic xmlns:pic="http://schemas.openxmlformats.org/drawingml/2006/picture">
                   <pic:nvPicPr>
-                    <pic:cNvPr id="1315191072" name="Picture 1315191072"/>
+                    <pic:cNvPr id="546619094" name="Picture 546619094"/>
                     <pic:cNvPicPr/>
                   </pic:nvPicPr>
                   <pic:blipFill>
@@ -1157,14 +1157,6 @@
                 <w:sz w:val="24"/>
               </w:rPr>
             </w:pPr>
-            <w:r>
-              <w:rPr>
-                <w:rFonts w:ascii="Times New Roman" w:hAnsi="Times New Roman" w:cs="Times New Roman"/>
-                <w:spacing w:val="-2"/>
-                <w:sz w:val="24"/>
-              </w:rPr>
-              <w:t>***********</w:t>
-            </w:r>
           </w:p>
         </w:tc>
       </w:tr>
@@ -1359,6 +1351,14 @@
                 <w:sz w:val="24"/>
               </w:rPr>
               <w:t>Online</w:t>
+            </w:r>
+            <w:r>
+              <w:rPr>
+                <w:rFonts w:ascii="Times New Roman" w:hAnsi="Times New Roman" w:cs="Times New Roman"/>
+                <w:spacing w:val="-2"/>
+                <w:sz w:val="24"/>
+              </w:rPr>
+              <w:t xml:space="preserve"> / Remote</w:t>
             </w:r>
           </w:p>
         </w:tc>
@@ -5158,7 +5158,23 @@
                 <w:spacing w:val="-4"/>
                 <w:sz w:val="20"/>
               </w:rPr>
-              <w:t xml:space="preserve">Kapil, </w:t>
+              <w:t>Ka</w:t>
+            </w:r>
+            <w:r>
+              <w:rPr>
+                <w:rFonts w:ascii="Times New Roman" w:hAnsi="Times New Roman" w:cs="Times New Roman"/>
+                <w:spacing w:val="-4"/>
+                <w:sz w:val="20"/>
+              </w:rPr>
+              <w:t>bir</w:t>
+            </w:r>
+            <w:r>
+              <w:rPr>
+                <w:rFonts w:ascii="Times New Roman" w:hAnsi="Times New Roman" w:cs="Times New Roman"/>
+                <w:spacing w:val="-4"/>
+                <w:sz w:val="20"/>
+              </w:rPr>
+              <w:t xml:space="preserve">, </w:t>
             </w:r>
             <w:r>
               <w:rPr>
@@ -7076,7 +7092,25 @@
                 <w:w w:val="90"/>
                 <w:sz w:val="20"/>
               </w:rPr>
-              <w:t>22/03/2026</w:t>
+              <w:t>2</w:t>
+            </w:r>
+            <w:r>
+              <w:rPr>
+                <w:rFonts w:ascii="Times New Roman" w:hAnsi="Times New Roman" w:cs="Times New Roman"/>
+                <w:spacing w:val="-2"/>
+                <w:w w:val="90"/>
+                <w:sz w:val="20"/>
+              </w:rPr>
+              <w:t>1</w:t>
+            </w:r>
+            <w:r>
+              <w:rPr>
+                <w:rFonts w:ascii="Times New Roman" w:hAnsi="Times New Roman" w:cs="Times New Roman"/>
+                <w:spacing w:val="-2"/>
+                <w:w w:val="90"/>
+                <w:sz w:val="20"/>
+              </w:rPr>
+              <w:t>/03/2026</w:t>
             </w:r>
           </w:p>
         </w:tc>
@@ -10125,14 +10159,21 @@
               <w:rPr>
                 <w:rFonts w:ascii="Times New Roman" w:hAnsi="Times New Roman" w:cs="Times New Roman"/>
               </w:rPr>
-              <w:t>January</w:t>
+              <w:t>December</w:t>
             </w:r>
             <w:r>
               <w:rPr>
                 <w:rFonts w:ascii="Times New Roman" w:hAnsi="Times New Roman" w:cs="Times New Roman"/>
                 <w:spacing w:val="-4"/>
               </w:rPr>
-              <w:t xml:space="preserve"> 2026</w:t>
+              <w:t xml:space="preserve"> 202</w:t>
+            </w:r>
+            <w:r>
+              <w:rPr>
+                <w:rFonts w:ascii="Times New Roman" w:hAnsi="Times New Roman" w:cs="Times New Roman"/>
+                <w:spacing w:val="-4"/>
+              </w:rPr>
+              <w:t>5</w:t>
             </w:r>
           </w:p>
         </w:tc>
@@ -10515,14 +10556,14 @@
             </w:pPr>
             <w:r>
               <w:rPr>
-                <w:rFonts w:ascii="Times New Roman" w:hAnsi="Times New Roman" w:cs="Times New Roman"/>
-                <w:spacing w:val="-2"/>
-              </w:rPr>
-              <w:t>02-12-</w:t>
-            </w:r>
-            <w:r>
-              <w:rPr>
-                <w:rFonts w:ascii="Times New Roman" w:hAnsi="Times New Roman" w:cs="Times New Roman"/>
+                <w:rFonts w:ascii="Calibri"/>
+                <w:spacing w:val="-2"/>
+              </w:rPr>
+              <w:t>22-12-</w:t>
+            </w:r>
+            <w:r>
+              <w:rPr>
+                <w:rFonts w:ascii="Calibri"/>
                 <w:spacing w:val="-4"/>
               </w:rPr>
               <w:t>2025</w:t>
@@ -10545,14 +10586,14 @@
             </w:pPr>
             <w:r>
               <w:rPr>
-                <w:rFonts w:ascii="Times New Roman" w:hAnsi="Times New Roman" w:cs="Times New Roman"/>
-                <w:spacing w:val="-2"/>
-              </w:rPr>
-              <w:t>03-12-</w:t>
-            </w:r>
-            <w:r>
-              <w:rPr>
-                <w:rFonts w:ascii="Times New Roman" w:hAnsi="Times New Roman" w:cs="Times New Roman"/>
+                <w:rFonts w:ascii="Calibri"/>
+                <w:spacing w:val="-2"/>
+              </w:rPr>
+              <w:t>23-12-</w:t>
+            </w:r>
+            <w:r>
+              <w:rPr>
+                <w:rFonts w:ascii="Calibri"/>
                 <w:spacing w:val="-4"/>
               </w:rPr>
               <w:t>2025</w:t>
@@ -10569,20 +10610,21 @@
               <w:pStyle w:val="TableParagraph"/>
               <w:spacing w:before="57"/>
               <w:ind w:left="142"/>
-              <w:rPr>
-                <w:rFonts w:ascii="Times New Roman" w:hAnsi="Times New Roman" w:cs="Times New Roman"/>
-              </w:rPr>
-            </w:pPr>
-            <w:r>
-              <w:rPr>
-                <w:rFonts w:ascii="Times New Roman" w:hAnsi="Times New Roman" w:cs="Times New Roman"/>
-                <w:spacing w:val="-2"/>
-              </w:rPr>
-              <w:t>04-12-</w:t>
-            </w:r>
-            <w:r>
-              <w:rPr>
-                <w:rFonts w:ascii="Times New Roman" w:hAnsi="Times New Roman" w:cs="Times New Roman"/>
+              <w:jc w:val="center"/>
+              <w:rPr>
+                <w:rFonts w:ascii="Times New Roman" w:hAnsi="Times New Roman" w:cs="Times New Roman"/>
+              </w:rPr>
+            </w:pPr>
+            <w:r>
+              <w:rPr>
+                <w:rFonts w:ascii="Calibri"/>
+                <w:spacing w:val="-2"/>
+              </w:rPr>
+              <w:t>24-12-</w:t>
+            </w:r>
+            <w:r>
+              <w:rPr>
+                <w:rFonts w:ascii="Calibri"/>
                 <w:spacing w:val="-4"/>
               </w:rPr>
               <w:t>2025</w:t>
@@ -10605,14 +10647,14 @@
             </w:pPr>
             <w:r>
               <w:rPr>
-                <w:rFonts w:ascii="Times New Roman" w:hAnsi="Times New Roman" w:cs="Times New Roman"/>
-                <w:spacing w:val="-2"/>
-              </w:rPr>
-              <w:t>05-12-</w:t>
-            </w:r>
-            <w:r>
-              <w:rPr>
-                <w:rFonts w:ascii="Times New Roman" w:hAnsi="Times New Roman" w:cs="Times New Roman"/>
+                <w:rFonts w:ascii="Calibri"/>
+                <w:spacing w:val="-2"/>
+              </w:rPr>
+              <w:t>25-12-</w:t>
+            </w:r>
+            <w:r>
+              <w:rPr>
+                <w:rFonts w:ascii="Calibri"/>
                 <w:spacing w:val="-4"/>
               </w:rPr>
               <w:t>2025</w:t>
@@ -10635,14 +10677,14 @@
             </w:pPr>
             <w:r>
               <w:rPr>
-                <w:rFonts w:ascii="Times New Roman" w:hAnsi="Times New Roman" w:cs="Times New Roman"/>
-                <w:spacing w:val="-2"/>
-              </w:rPr>
-              <w:t>06-12-</w:t>
-            </w:r>
-            <w:r>
-              <w:rPr>
-                <w:rFonts w:ascii="Times New Roman" w:hAnsi="Times New Roman" w:cs="Times New Roman"/>
+                <w:rFonts w:ascii="Calibri"/>
+                <w:spacing w:val="-2"/>
+              </w:rPr>
+              <w:t>26-12-</w:t>
+            </w:r>
+            <w:r>
+              <w:rPr>
+                <w:rFonts w:ascii="Calibri"/>
                 <w:spacing w:val="-4"/>
               </w:rPr>
               <w:t>2025</w:t>
@@ -10665,14 +10707,14 @@
             </w:pPr>
             <w:r>
               <w:rPr>
-                <w:rFonts w:ascii="Times New Roman" w:hAnsi="Times New Roman" w:cs="Times New Roman"/>
-                <w:spacing w:val="-2"/>
-              </w:rPr>
-              <w:t>07-12-</w:t>
-            </w:r>
-            <w:r>
-              <w:rPr>
-                <w:rFonts w:ascii="Times New Roman" w:hAnsi="Times New Roman" w:cs="Times New Roman"/>
+                <w:rFonts w:ascii="Calibri"/>
+                <w:spacing w:val="-2"/>
+              </w:rPr>
+              <w:t>27-12-</w:t>
+            </w:r>
+            <w:r>
+              <w:rPr>
+                <w:rFonts w:ascii="Calibri"/>
                 <w:spacing w:val="-4"/>
               </w:rPr>
               <w:t>2025</w:t>
@@ -10718,7 +10760,7 @@
             </w:pPr>
             <w:r>
               <w:rPr>
-                <w:rFonts w:ascii="Times New Roman" w:hAnsi="Times New Roman" w:cs="Times New Roman"/>
+                <w:rFonts w:ascii="Calibri"/>
                 <w:color w:val="AEAAAA"/>
                 <w:spacing w:val="-2"/>
               </w:rPr>
@@ -10742,7 +10784,7 @@
             </w:pPr>
             <w:r>
               <w:rPr>
-                <w:rFonts w:ascii="Times New Roman" w:hAnsi="Times New Roman" w:cs="Times New Roman"/>
+                <w:rFonts w:ascii="Calibri"/>
                 <w:color w:val="AEAAAA"/>
                 <w:spacing w:val="-2"/>
               </w:rPr>
@@ -10760,13 +10802,14 @@
               <w:pStyle w:val="TableParagraph"/>
               <w:spacing w:before="57"/>
               <w:ind w:left="444"/>
-              <w:rPr>
-                <w:rFonts w:ascii="Times New Roman" w:hAnsi="Times New Roman" w:cs="Times New Roman"/>
-              </w:rPr>
-            </w:pPr>
-            <w:r>
-              <w:rPr>
-                <w:rFonts w:ascii="Times New Roman" w:hAnsi="Times New Roman" w:cs="Times New Roman"/>
+              <w:jc w:val="center"/>
+              <w:rPr>
+                <w:rFonts w:ascii="Times New Roman" w:hAnsi="Times New Roman" w:cs="Times New Roman"/>
+              </w:rPr>
+            </w:pPr>
+            <w:r>
+              <w:rPr>
+                <w:rFonts w:ascii="Calibri"/>
                 <w:color w:val="AEAAAA"/>
                 <w:spacing w:val="-2"/>
               </w:rPr>
@@ -10790,7 +10833,7 @@
             </w:pPr>
             <w:r>
               <w:rPr>
-                <w:rFonts w:ascii="Times New Roman" w:hAnsi="Times New Roman" w:cs="Times New Roman"/>
+                <w:rFonts w:ascii="Calibri"/>
                 <w:color w:val="AEAAAA"/>
                 <w:spacing w:val="-2"/>
               </w:rPr>
@@ -10814,7 +10857,7 @@
             </w:pPr>
             <w:r>
               <w:rPr>
-                <w:rFonts w:ascii="Times New Roman" w:hAnsi="Times New Roman" w:cs="Times New Roman"/>
+                <w:rFonts w:ascii="Calibri"/>
                 <w:color w:val="AEAAAA"/>
                 <w:spacing w:val="-2"/>
               </w:rPr>
@@ -10838,7 +10881,7 @@
             </w:pPr>
             <w:r>
               <w:rPr>
-                <w:rFonts w:ascii="Times New Roman" w:hAnsi="Times New Roman" w:cs="Times New Roman"/>
+                <w:rFonts w:ascii="Calibri"/>
                 <w:color w:val="AEAAAA"/>
                 <w:spacing w:val="-2"/>
               </w:rPr>
@@ -10893,14 +10936,14 @@
             </w:pPr>
             <w:r>
               <w:rPr>
-                <w:rFonts w:ascii="Times New Roman" w:hAnsi="Times New Roman" w:cs="Times New Roman"/>
-                <w:spacing w:val="-2"/>
-              </w:rPr>
-              <w:t>09-12-</w:t>
-            </w:r>
-            <w:r>
-              <w:rPr>
-                <w:rFonts w:ascii="Times New Roman" w:hAnsi="Times New Roman" w:cs="Times New Roman"/>
+                <w:rFonts w:ascii="Calibri"/>
+                <w:spacing w:val="-2"/>
+              </w:rPr>
+              <w:t>29-12-</w:t>
+            </w:r>
+            <w:r>
+              <w:rPr>
+                <w:rFonts w:ascii="Calibri"/>
                 <w:spacing w:val="-4"/>
               </w:rPr>
               <w:t>2025</w:t>
@@ -10923,14 +10966,14 @@
             </w:pPr>
             <w:r>
               <w:rPr>
-                <w:rFonts w:ascii="Times New Roman" w:hAnsi="Times New Roman" w:cs="Times New Roman"/>
-                <w:spacing w:val="-2"/>
-              </w:rPr>
-              <w:t>10-12-</w:t>
-            </w:r>
-            <w:r>
-              <w:rPr>
-                <w:rFonts w:ascii="Times New Roman" w:hAnsi="Times New Roman" w:cs="Times New Roman"/>
+                <w:rFonts w:ascii="Calibri"/>
+                <w:spacing w:val="-2"/>
+              </w:rPr>
+              <w:t>30-12-</w:t>
+            </w:r>
+            <w:r>
+              <w:rPr>
+                <w:rFonts w:ascii="Calibri"/>
                 <w:spacing w:val="-4"/>
               </w:rPr>
               <w:t>2025</w:t>
@@ -10947,20 +10990,21 @@
               <w:pStyle w:val="TableParagraph"/>
               <w:spacing w:before="57"/>
               <w:ind w:left="142"/>
-              <w:rPr>
-                <w:rFonts w:ascii="Times New Roman" w:hAnsi="Times New Roman" w:cs="Times New Roman"/>
-              </w:rPr>
-            </w:pPr>
-            <w:r>
-              <w:rPr>
-                <w:rFonts w:ascii="Times New Roman" w:hAnsi="Times New Roman" w:cs="Times New Roman"/>
-                <w:spacing w:val="-2"/>
-              </w:rPr>
-              <w:t>11-12-</w:t>
-            </w:r>
-            <w:r>
-              <w:rPr>
-                <w:rFonts w:ascii="Times New Roman" w:hAnsi="Times New Roman" w:cs="Times New Roman"/>
+              <w:jc w:val="center"/>
+              <w:rPr>
+                <w:rFonts w:ascii="Times New Roman" w:hAnsi="Times New Roman" w:cs="Times New Roman"/>
+              </w:rPr>
+            </w:pPr>
+            <w:r>
+              <w:rPr>
+                <w:rFonts w:ascii="Calibri"/>
+                <w:spacing w:val="-2"/>
+              </w:rPr>
+              <w:t>31-12-</w:t>
+            </w:r>
+            <w:r>
+              <w:rPr>
+                <w:rFonts w:ascii="Calibri"/>
                 <w:spacing w:val="-4"/>
               </w:rPr>
               <w:t>2025</w:t>
@@ -10983,17 +11027,17 @@
             </w:pPr>
             <w:r>
               <w:rPr>
-                <w:rFonts w:ascii="Times New Roman" w:hAnsi="Times New Roman" w:cs="Times New Roman"/>
-                <w:spacing w:val="-2"/>
-              </w:rPr>
-              <w:t>12-12-</w:t>
-            </w:r>
-            <w:r>
-              <w:rPr>
-                <w:rFonts w:ascii="Times New Roman" w:hAnsi="Times New Roman" w:cs="Times New Roman"/>
+                <w:rFonts w:ascii="Calibri"/>
+                <w:spacing w:val="-2"/>
+              </w:rPr>
+              <w:t>01-01-</w:t>
+            </w:r>
+            <w:r>
+              <w:rPr>
+                <w:rFonts w:ascii="Calibri"/>
                 <w:spacing w:val="-4"/>
               </w:rPr>
-              <w:t>2025</w:t>
+              <w:t>2026</w:t>
             </w:r>
           </w:p>
         </w:tc>
@@ -11013,17 +11057,17 @@
             </w:pPr>
             <w:r>
               <w:rPr>
-                <w:rFonts w:ascii="Times New Roman" w:hAnsi="Times New Roman" w:cs="Times New Roman"/>
-                <w:spacing w:val="-2"/>
-              </w:rPr>
-              <w:t>13-12-</w:t>
-            </w:r>
-            <w:r>
-              <w:rPr>
-                <w:rFonts w:ascii="Times New Roman" w:hAnsi="Times New Roman" w:cs="Times New Roman"/>
+                <w:rFonts w:ascii="Calibri"/>
+                <w:spacing w:val="-2"/>
+              </w:rPr>
+              <w:t>02-01-</w:t>
+            </w:r>
+            <w:r>
+              <w:rPr>
+                <w:rFonts w:ascii="Calibri"/>
                 <w:spacing w:val="-4"/>
               </w:rPr>
-              <w:t>2025</w:t>
+              <w:t>2026</w:t>
             </w:r>
           </w:p>
         </w:tc>
@@ -11043,17 +11087,17 @@
             </w:pPr>
             <w:r>
               <w:rPr>
-                <w:rFonts w:ascii="Times New Roman" w:hAnsi="Times New Roman" w:cs="Times New Roman"/>
-                <w:spacing w:val="-2"/>
-              </w:rPr>
-              <w:t>14-12-</w:t>
-            </w:r>
-            <w:r>
-              <w:rPr>
-                <w:rFonts w:ascii="Times New Roman" w:hAnsi="Times New Roman" w:cs="Times New Roman"/>
+                <w:rFonts w:ascii="Calibri"/>
+                <w:spacing w:val="-2"/>
+              </w:rPr>
+              <w:t>03-01-</w:t>
+            </w:r>
+            <w:r>
+              <w:rPr>
+                <w:rFonts w:ascii="Calibri"/>
                 <w:spacing w:val="-4"/>
               </w:rPr>
-              <w:t>2025</w:t>
+              <w:t>2026</w:t>
             </w:r>
           </w:p>
         </w:tc>
@@ -11096,7 +11140,7 @@
             </w:pPr>
             <w:r>
               <w:rPr>
-                <w:rFonts w:ascii="Times New Roman" w:hAnsi="Times New Roman" w:cs="Times New Roman"/>
+                <w:rFonts w:ascii="Calibri"/>
                 <w:color w:val="AEAAAA"/>
                 <w:spacing w:val="-2"/>
               </w:rPr>
@@ -11120,7 +11164,7 @@
             </w:pPr>
             <w:r>
               <w:rPr>
-                <w:rFonts w:ascii="Times New Roman" w:hAnsi="Times New Roman" w:cs="Times New Roman"/>
+                <w:rFonts w:ascii="Calibri"/>
                 <w:color w:val="AEAAAA"/>
                 <w:spacing w:val="-2"/>
               </w:rPr>
@@ -11138,13 +11182,14 @@
               <w:pStyle w:val="TableParagraph"/>
               <w:spacing w:before="57"/>
               <w:ind w:left="444"/>
-              <w:rPr>
-                <w:rFonts w:ascii="Times New Roman" w:hAnsi="Times New Roman" w:cs="Times New Roman"/>
-              </w:rPr>
-            </w:pPr>
-            <w:r>
-              <w:rPr>
-                <w:rFonts w:ascii="Times New Roman" w:hAnsi="Times New Roman" w:cs="Times New Roman"/>
+              <w:jc w:val="center"/>
+              <w:rPr>
+                <w:rFonts w:ascii="Times New Roman" w:hAnsi="Times New Roman" w:cs="Times New Roman"/>
+              </w:rPr>
+            </w:pPr>
+            <w:r>
+              <w:rPr>
+                <w:rFonts w:ascii="Calibri"/>
                 <w:color w:val="AEAAAA"/>
                 <w:spacing w:val="-2"/>
               </w:rPr>
@@ -11168,7 +11213,7 @@
             </w:pPr>
             <w:r>
               <w:rPr>
-                <w:rFonts w:ascii="Times New Roman" w:hAnsi="Times New Roman" w:cs="Times New Roman"/>
+                <w:rFonts w:ascii="Calibri"/>
                 <w:color w:val="AEAAAA"/>
                 <w:spacing w:val="-2"/>
               </w:rPr>
@@ -11192,7 +11237,7 @@
             </w:pPr>
             <w:r>
               <w:rPr>
-                <w:rFonts w:ascii="Times New Roman" w:hAnsi="Times New Roman" w:cs="Times New Roman"/>
+                <w:rFonts w:ascii="Calibri"/>
                 <w:color w:val="AEAAAA"/>
                 <w:spacing w:val="-2"/>
               </w:rPr>
@@ -11216,7 +11261,7 @@
             </w:pPr>
             <w:r>
               <w:rPr>
-                <w:rFonts w:ascii="Times New Roman" w:hAnsi="Times New Roman" w:cs="Times New Roman"/>
+                <w:rFonts w:ascii="Calibri"/>
                 <w:color w:val="AEAAAA"/>
                 <w:spacing w:val="-2"/>
               </w:rPr>
@@ -11271,17 +11316,17 @@
             </w:pPr>
             <w:r>
               <w:rPr>
-                <w:rFonts w:ascii="Times New Roman" w:hAnsi="Times New Roman" w:cs="Times New Roman"/>
-                <w:spacing w:val="-2"/>
-              </w:rPr>
-              <w:t>16-12-</w:t>
-            </w:r>
-            <w:r>
-              <w:rPr>
-                <w:rFonts w:ascii="Times New Roman" w:hAnsi="Times New Roman" w:cs="Times New Roman"/>
+                <w:rFonts w:ascii="Calibri"/>
+                <w:spacing w:val="-2"/>
+              </w:rPr>
+              <w:t>05-01-</w:t>
+            </w:r>
+            <w:r>
+              <w:rPr>
+                <w:rFonts w:ascii="Calibri"/>
                 <w:spacing w:val="-4"/>
               </w:rPr>
-              <w:t>2025</w:t>
+              <w:t>2026</w:t>
             </w:r>
           </w:p>
         </w:tc>
@@ -11301,17 +11346,17 @@
             </w:pPr>
             <w:r>
               <w:rPr>
-                <w:rFonts w:ascii="Times New Roman" w:hAnsi="Times New Roman" w:cs="Times New Roman"/>
-                <w:spacing w:val="-2"/>
-              </w:rPr>
-              <w:t>17-12-</w:t>
-            </w:r>
-            <w:r>
-              <w:rPr>
-                <w:rFonts w:ascii="Times New Roman" w:hAnsi="Times New Roman" w:cs="Times New Roman"/>
+                <w:rFonts w:ascii="Calibri"/>
+                <w:spacing w:val="-2"/>
+              </w:rPr>
+              <w:t>06-01-</w:t>
+            </w:r>
+            <w:r>
+              <w:rPr>
+                <w:rFonts w:ascii="Calibri"/>
                 <w:spacing w:val="-4"/>
               </w:rPr>
-              <w:t>2025</w:t>
+              <w:t>2026</w:t>
             </w:r>
           </w:p>
         </w:tc>
@@ -11325,23 +11370,24 @@
               <w:pStyle w:val="TableParagraph"/>
               <w:spacing w:before="57"/>
               <w:ind w:left="142"/>
-              <w:rPr>
-                <w:rFonts w:ascii="Times New Roman" w:hAnsi="Times New Roman" w:cs="Times New Roman"/>
-              </w:rPr>
-            </w:pPr>
-            <w:r>
-              <w:rPr>
-                <w:rFonts w:ascii="Times New Roman" w:hAnsi="Times New Roman" w:cs="Times New Roman"/>
-                <w:spacing w:val="-2"/>
-              </w:rPr>
-              <w:t>18-12-</w:t>
-            </w:r>
-            <w:r>
-              <w:rPr>
-                <w:rFonts w:ascii="Times New Roman" w:hAnsi="Times New Roman" w:cs="Times New Roman"/>
+              <w:jc w:val="center"/>
+              <w:rPr>
+                <w:rFonts w:ascii="Times New Roman" w:hAnsi="Times New Roman" w:cs="Times New Roman"/>
+              </w:rPr>
+            </w:pPr>
+            <w:r>
+              <w:rPr>
+                <w:rFonts w:ascii="Calibri"/>
+                <w:spacing w:val="-2"/>
+              </w:rPr>
+              <w:t>07-01-</w:t>
+            </w:r>
+            <w:r>
+              <w:rPr>
+                <w:rFonts w:ascii="Calibri"/>
                 <w:spacing w:val="-4"/>
               </w:rPr>
-              <w:t>2025</w:t>
+              <w:t>2026</w:t>
             </w:r>
           </w:p>
         </w:tc>
@@ -11361,17 +11407,17 @@
             </w:pPr>
             <w:r>
               <w:rPr>
-                <w:rFonts w:ascii="Times New Roman" w:hAnsi="Times New Roman" w:cs="Times New Roman"/>
-                <w:spacing w:val="-2"/>
-              </w:rPr>
-              <w:t>19-12-</w:t>
-            </w:r>
-            <w:r>
-              <w:rPr>
-                <w:rFonts w:ascii="Times New Roman" w:hAnsi="Times New Roman" w:cs="Times New Roman"/>
+                <w:rFonts w:ascii="Calibri"/>
+                <w:spacing w:val="-2"/>
+              </w:rPr>
+              <w:t>08-01-</w:t>
+            </w:r>
+            <w:r>
+              <w:rPr>
+                <w:rFonts w:ascii="Calibri"/>
                 <w:spacing w:val="-4"/>
               </w:rPr>
-              <w:t>2025</w:t>
+              <w:t>2026</w:t>
             </w:r>
           </w:p>
         </w:tc>
@@ -11391,17 +11437,17 @@
             </w:pPr>
             <w:r>
               <w:rPr>
-                <w:rFonts w:ascii="Times New Roman" w:hAnsi="Times New Roman" w:cs="Times New Roman"/>
-                <w:spacing w:val="-2"/>
-              </w:rPr>
-              <w:t>20-12-</w:t>
-            </w:r>
-            <w:r>
-              <w:rPr>
-                <w:rFonts w:ascii="Times New Roman" w:hAnsi="Times New Roman" w:cs="Times New Roman"/>
+                <w:rFonts w:ascii="Calibri"/>
+                <w:spacing w:val="-2"/>
+              </w:rPr>
+              <w:t>09-01-</w:t>
+            </w:r>
+            <w:r>
+              <w:rPr>
+                <w:rFonts w:ascii="Calibri"/>
                 <w:spacing w:val="-4"/>
               </w:rPr>
-              <w:t>2025</w:t>
+              <w:t>2026</w:t>
             </w:r>
           </w:p>
         </w:tc>
@@ -11421,17 +11467,17 @@
             </w:pPr>
             <w:r>
               <w:rPr>
-                <w:rFonts w:ascii="Times New Roman" w:hAnsi="Times New Roman" w:cs="Times New Roman"/>
-                <w:spacing w:val="-2"/>
-              </w:rPr>
-              <w:t>21-12-</w:t>
-            </w:r>
-            <w:r>
-              <w:rPr>
-                <w:rFonts w:ascii="Times New Roman" w:hAnsi="Times New Roman" w:cs="Times New Roman"/>
+                <w:rFonts w:ascii="Calibri"/>
+                <w:spacing w:val="-2"/>
+              </w:rPr>
+              <w:t>10-01-</w:t>
+            </w:r>
+            <w:r>
+              <w:rPr>
+                <w:rFonts w:ascii="Calibri"/>
                 <w:spacing w:val="-4"/>
               </w:rPr>
-              <w:t>2025</w:t>
+              <w:t>2026</w:t>
             </w:r>
           </w:p>
         </w:tc>
@@ -11474,7 +11520,7 @@
             </w:pPr>
             <w:r>
               <w:rPr>
-                <w:rFonts w:ascii="Times New Roman" w:hAnsi="Times New Roman" w:cs="Times New Roman"/>
+                <w:rFonts w:ascii="Calibri"/>
                 <w:color w:val="AEAAAA"/>
                 <w:spacing w:val="-2"/>
               </w:rPr>
@@ -11498,7 +11544,7 @@
             </w:pPr>
             <w:r>
               <w:rPr>
-                <w:rFonts w:ascii="Times New Roman" w:hAnsi="Times New Roman" w:cs="Times New Roman"/>
+                <w:rFonts w:ascii="Calibri"/>
                 <w:color w:val="AEAAAA"/>
                 <w:spacing w:val="-2"/>
               </w:rPr>
@@ -11516,13 +11562,14 @@
               <w:pStyle w:val="TableParagraph"/>
               <w:spacing w:before="57"/>
               <w:ind w:left="444"/>
-              <w:rPr>
-                <w:rFonts w:ascii="Times New Roman" w:hAnsi="Times New Roman" w:cs="Times New Roman"/>
-              </w:rPr>
-            </w:pPr>
-            <w:r>
-              <w:rPr>
-                <w:rFonts w:ascii="Times New Roman" w:hAnsi="Times New Roman" w:cs="Times New Roman"/>
+              <w:jc w:val="center"/>
+              <w:rPr>
+                <w:rFonts w:ascii="Times New Roman" w:hAnsi="Times New Roman" w:cs="Times New Roman"/>
+              </w:rPr>
+            </w:pPr>
+            <w:r>
+              <w:rPr>
+                <w:rFonts w:ascii="Calibri"/>
                 <w:color w:val="AEAAAA"/>
                 <w:spacing w:val="-2"/>
               </w:rPr>
@@ -11546,7 +11593,7 @@
             </w:pPr>
             <w:r>
               <w:rPr>
-                <w:rFonts w:ascii="Times New Roman" w:hAnsi="Times New Roman" w:cs="Times New Roman"/>
+                <w:rFonts w:ascii="Calibri"/>
                 <w:color w:val="AEAAAA"/>
                 <w:spacing w:val="-2"/>
               </w:rPr>
@@ -11570,7 +11617,7 @@
             </w:pPr>
             <w:r>
               <w:rPr>
-                <w:rFonts w:ascii="Times New Roman" w:hAnsi="Times New Roman" w:cs="Times New Roman"/>
+                <w:rFonts w:ascii="Calibri"/>
                 <w:color w:val="AEAAAA"/>
                 <w:spacing w:val="-2"/>
               </w:rPr>
@@ -11594,7 +11641,7 @@
             </w:pPr>
             <w:r>
               <w:rPr>
-                <w:rFonts w:ascii="Times New Roman" w:hAnsi="Times New Roman" w:cs="Times New Roman"/>
+                <w:rFonts w:ascii="Calibri"/>
                 <w:color w:val="AEAAAA"/>
                 <w:spacing w:val="-2"/>
               </w:rPr>
@@ -11649,17 +11696,17 @@
             </w:pPr>
             <w:r>
               <w:rPr>
-                <w:rFonts w:ascii="Times New Roman" w:hAnsi="Times New Roman" w:cs="Times New Roman"/>
-                <w:spacing w:val="-2"/>
-              </w:rPr>
-              <w:t>23-12-</w:t>
-            </w:r>
-            <w:r>
-              <w:rPr>
-                <w:rFonts w:ascii="Times New Roman" w:hAnsi="Times New Roman" w:cs="Times New Roman"/>
+                <w:rFonts w:ascii="Calibri"/>
+                <w:spacing w:val="-2"/>
+              </w:rPr>
+              <w:t>12-01-</w:t>
+            </w:r>
+            <w:r>
+              <w:rPr>
+                <w:rFonts w:ascii="Calibri"/>
                 <w:spacing w:val="-4"/>
               </w:rPr>
-              <w:t>2025</w:t>
+              <w:t>2026</w:t>
             </w:r>
           </w:p>
         </w:tc>
@@ -11679,17 +11726,17 @@
             </w:pPr>
             <w:r>
               <w:rPr>
-                <w:rFonts w:ascii="Times New Roman" w:hAnsi="Times New Roman" w:cs="Times New Roman"/>
-                <w:spacing w:val="-2"/>
-              </w:rPr>
-              <w:t>24-12-</w:t>
-            </w:r>
-            <w:r>
-              <w:rPr>
-                <w:rFonts w:ascii="Times New Roman" w:hAnsi="Times New Roman" w:cs="Times New Roman"/>
+                <w:rFonts w:ascii="Calibri"/>
+                <w:spacing w:val="-2"/>
+              </w:rPr>
+              <w:t>13-01-</w:t>
+            </w:r>
+            <w:r>
+              <w:rPr>
+                <w:rFonts w:ascii="Calibri"/>
                 <w:spacing w:val="-4"/>
               </w:rPr>
-              <w:t>2025</w:t>
+              <w:t>2026</w:t>
             </w:r>
           </w:p>
         </w:tc>
@@ -11701,10 +11748,25 @@
           <w:p>
             <w:pPr>
               <w:pStyle w:val="TableParagraph"/>
-              <w:rPr>
-                <w:rFonts w:ascii="Times New Roman" w:hAnsi="Times New Roman" w:cs="Times New Roman"/>
-              </w:rPr>
-            </w:pPr>
+              <w:jc w:val="center"/>
+              <w:rPr>
+                <w:rFonts w:ascii="Times New Roman" w:hAnsi="Times New Roman" w:cs="Times New Roman"/>
+              </w:rPr>
+            </w:pPr>
+            <w:r>
+              <w:rPr>
+                <w:rFonts w:ascii="Calibri"/>
+                <w:spacing w:val="-2"/>
+              </w:rPr>
+              <w:t>14-01-</w:t>
+            </w:r>
+            <w:r>
+              <w:rPr>
+                <w:rFonts w:ascii="Calibri"/>
+                <w:spacing w:val="-4"/>
+              </w:rPr>
+              <w:t>2026</w:t>
+            </w:r>
           </w:p>
         </w:tc>
         <w:tc>
@@ -11714,10 +11776,25 @@
           <w:p>
             <w:pPr>
               <w:pStyle w:val="TableParagraph"/>
-              <w:rPr>
-                <w:rFonts w:ascii="Times New Roman" w:hAnsi="Times New Roman" w:cs="Times New Roman"/>
-              </w:rPr>
-            </w:pPr>
+              <w:jc w:val="center"/>
+              <w:rPr>
+                <w:rFonts w:ascii="Times New Roman" w:hAnsi="Times New Roman" w:cs="Times New Roman"/>
+              </w:rPr>
+            </w:pPr>
+            <w:r>
+              <w:rPr>
+                <w:rFonts w:ascii="Calibri"/>
+                <w:spacing w:val="-2"/>
+              </w:rPr>
+              <w:t>15-01-</w:t>
+            </w:r>
+            <w:r>
+              <w:rPr>
+                <w:rFonts w:ascii="Calibri"/>
+                <w:spacing w:val="-4"/>
+              </w:rPr>
+              <w:t>2026</w:t>
+            </w:r>
           </w:p>
         </w:tc>
         <w:tc>
@@ -11727,10 +11804,25 @@
           <w:p>
             <w:pPr>
               <w:pStyle w:val="TableParagraph"/>
-              <w:rPr>
-                <w:rFonts w:ascii="Times New Roman" w:hAnsi="Times New Roman" w:cs="Times New Roman"/>
-              </w:rPr>
-            </w:pPr>
+              <w:jc w:val="center"/>
+              <w:rPr>
+                <w:rFonts w:ascii="Times New Roman" w:hAnsi="Times New Roman" w:cs="Times New Roman"/>
+              </w:rPr>
+            </w:pPr>
+            <w:r>
+              <w:rPr>
+                <w:rFonts w:ascii="Calibri"/>
+                <w:spacing w:val="-2"/>
+              </w:rPr>
+              <w:t>16-01-</w:t>
+            </w:r>
+            <w:r>
+              <w:rPr>
+                <w:rFonts w:ascii="Calibri"/>
+                <w:spacing w:val="-4"/>
+              </w:rPr>
+              <w:t>2026</w:t>
+            </w:r>
           </w:p>
         </w:tc>
         <w:tc>
@@ -11740,10 +11832,25 @@
           <w:p>
             <w:pPr>
               <w:pStyle w:val="TableParagraph"/>
-              <w:rPr>
-                <w:rFonts w:ascii="Times New Roman" w:hAnsi="Times New Roman" w:cs="Times New Roman"/>
-              </w:rPr>
-            </w:pPr>
+              <w:jc w:val="center"/>
+              <w:rPr>
+                <w:rFonts w:ascii="Times New Roman" w:hAnsi="Times New Roman" w:cs="Times New Roman"/>
+              </w:rPr>
+            </w:pPr>
+            <w:r>
+              <w:rPr>
+                <w:rFonts w:ascii="Calibri"/>
+                <w:spacing w:val="-2"/>
+              </w:rPr>
+              <w:t>17-01-</w:t>
+            </w:r>
+            <w:r>
+              <w:rPr>
+                <w:rFonts w:ascii="Calibri"/>
+                <w:spacing w:val="-4"/>
+              </w:rPr>
+              <w:t>2026</w:t>
+            </w:r>
           </w:p>
         </w:tc>
       </w:tr>
@@ -11785,7 +11892,7 @@
             </w:pPr>
             <w:r>
               <w:rPr>
-                <w:rFonts w:ascii="Times New Roman" w:hAnsi="Times New Roman" w:cs="Times New Roman"/>
+                <w:rFonts w:ascii="Calibri"/>
                 <w:color w:val="AEAAAA"/>
                 <w:spacing w:val="-2"/>
               </w:rPr>
@@ -11809,7 +11916,7 @@
             </w:pPr>
             <w:r>
               <w:rPr>
-                <w:rFonts w:ascii="Times New Roman" w:hAnsi="Times New Roman" w:cs="Times New Roman"/>
+                <w:rFonts w:ascii="Calibri"/>
                 <w:color w:val="AEAAAA"/>
                 <w:spacing w:val="-2"/>
               </w:rPr>
@@ -11825,10 +11932,19 @@
           <w:p>
             <w:pPr>
               <w:pStyle w:val="TableParagraph"/>
-              <w:rPr>
-                <w:rFonts w:ascii="Times New Roman" w:hAnsi="Times New Roman" w:cs="Times New Roman"/>
-              </w:rPr>
-            </w:pPr>
+              <w:jc w:val="center"/>
+              <w:rPr>
+                <w:rFonts w:ascii="Times New Roman" w:hAnsi="Times New Roman" w:cs="Times New Roman"/>
+              </w:rPr>
+            </w:pPr>
+            <w:r>
+              <w:rPr>
+                <w:rFonts w:ascii="Calibri"/>
+                <w:color w:val="AEAAAA"/>
+                <w:spacing w:val="-2"/>
+              </w:rPr>
+              <w:t>(Sign)</w:t>
+            </w:r>
           </w:p>
         </w:tc>
         <w:tc>
@@ -11838,10 +11954,19 @@
           <w:p>
             <w:pPr>
               <w:pStyle w:val="TableParagraph"/>
-              <w:rPr>
-                <w:rFonts w:ascii="Times New Roman" w:hAnsi="Times New Roman" w:cs="Times New Roman"/>
-              </w:rPr>
-            </w:pPr>
+              <w:jc w:val="center"/>
+              <w:rPr>
+                <w:rFonts w:ascii="Times New Roman" w:hAnsi="Times New Roman" w:cs="Times New Roman"/>
+              </w:rPr>
+            </w:pPr>
+            <w:r>
+              <w:rPr>
+                <w:rFonts w:ascii="Calibri"/>
+                <w:color w:val="AEAAAA"/>
+                <w:spacing w:val="-2"/>
+              </w:rPr>
+              <w:t>(Sign)</w:t>
+            </w:r>
           </w:p>
         </w:tc>
         <w:tc>
@@ -11851,10 +11976,19 @@
           <w:p>
             <w:pPr>
               <w:pStyle w:val="TableParagraph"/>
-              <w:rPr>
-                <w:rFonts w:ascii="Times New Roman" w:hAnsi="Times New Roman" w:cs="Times New Roman"/>
-              </w:rPr>
-            </w:pPr>
+              <w:jc w:val="center"/>
+              <w:rPr>
+                <w:rFonts w:ascii="Times New Roman" w:hAnsi="Times New Roman" w:cs="Times New Roman"/>
+              </w:rPr>
+            </w:pPr>
+            <w:r>
+              <w:rPr>
+                <w:rFonts w:ascii="Calibri"/>
+                <w:color w:val="AEAAAA"/>
+                <w:spacing w:val="-2"/>
+              </w:rPr>
+              <w:t>(Sign)</w:t>
+            </w:r>
           </w:p>
         </w:tc>
         <w:tc>
@@ -11864,10 +11998,19 @@
           <w:p>
             <w:pPr>
               <w:pStyle w:val="TableParagraph"/>
-              <w:rPr>
-                <w:rFonts w:ascii="Times New Roman" w:hAnsi="Times New Roman" w:cs="Times New Roman"/>
-              </w:rPr>
-            </w:pPr>
+              <w:jc w:val="center"/>
+              <w:rPr>
+                <w:rFonts w:ascii="Times New Roman" w:hAnsi="Times New Roman" w:cs="Times New Roman"/>
+              </w:rPr>
+            </w:pPr>
+            <w:r>
+              <w:rPr>
+                <w:rFonts w:ascii="Calibri"/>
+                <w:color w:val="AEAAAA"/>
+                <w:spacing w:val="-2"/>
+              </w:rPr>
+              <w:t>(Sign)</w:t>
+            </w:r>
           </w:p>
         </w:tc>
       </w:tr>
@@ -11908,10 +12051,25 @@
           <w:p>
             <w:pPr>
               <w:pStyle w:val="TableParagraph"/>
-              <w:rPr>
-                <w:rFonts w:ascii="Times New Roman" w:hAnsi="Times New Roman" w:cs="Times New Roman"/>
-              </w:rPr>
-            </w:pPr>
+              <w:jc w:val="center"/>
+              <w:rPr>
+                <w:rFonts w:ascii="Times New Roman" w:hAnsi="Times New Roman" w:cs="Times New Roman"/>
+              </w:rPr>
+            </w:pPr>
+            <w:r>
+              <w:rPr>
+                <w:rFonts w:ascii="Calibri"/>
+                <w:spacing w:val="-2"/>
+              </w:rPr>
+              <w:t>19-01-</w:t>
+            </w:r>
+            <w:r>
+              <w:rPr>
+                <w:rFonts w:ascii="Calibri"/>
+                <w:spacing w:val="-4"/>
+              </w:rPr>
+              <w:t>2026</w:t>
+            </w:r>
           </w:p>
         </w:tc>
         <w:tc>
@@ -11921,10 +12079,25 @@
           <w:p>
             <w:pPr>
               <w:pStyle w:val="TableParagraph"/>
-              <w:rPr>
-                <w:rFonts w:ascii="Times New Roman" w:hAnsi="Times New Roman" w:cs="Times New Roman"/>
-              </w:rPr>
-            </w:pPr>
+              <w:jc w:val="center"/>
+              <w:rPr>
+                <w:rFonts w:ascii="Times New Roman" w:hAnsi="Times New Roman" w:cs="Times New Roman"/>
+              </w:rPr>
+            </w:pPr>
+            <w:r>
+              <w:rPr>
+                <w:rFonts w:ascii="Calibri"/>
+                <w:spacing w:val="-2"/>
+              </w:rPr>
+              <w:t>20-01-</w:t>
+            </w:r>
+            <w:r>
+              <w:rPr>
+                <w:rFonts w:ascii="Calibri"/>
+                <w:spacing w:val="-4"/>
+              </w:rPr>
+              <w:t>2026</w:t>
+            </w:r>
           </w:p>
         </w:tc>
         <w:tc>
@@ -11935,10 +12108,25 @@
           <w:p>
             <w:pPr>
               <w:pStyle w:val="TableParagraph"/>
-              <w:rPr>
-                <w:rFonts w:ascii="Times New Roman" w:hAnsi="Times New Roman" w:cs="Times New Roman"/>
-              </w:rPr>
-            </w:pPr>
+              <w:jc w:val="center"/>
+              <w:rPr>
+                <w:rFonts w:ascii="Times New Roman" w:hAnsi="Times New Roman" w:cs="Times New Roman"/>
+              </w:rPr>
+            </w:pPr>
+            <w:r>
+              <w:rPr>
+                <w:rFonts w:ascii="Calibri"/>
+                <w:spacing w:val="-2"/>
+              </w:rPr>
+              <w:t>21-01-</w:t>
+            </w:r>
+            <w:r>
+              <w:rPr>
+                <w:rFonts w:ascii="Calibri"/>
+                <w:spacing w:val="-4"/>
+              </w:rPr>
+              <w:t>2026</w:t>
+            </w:r>
           </w:p>
         </w:tc>
         <w:tc>
@@ -11948,10 +12136,25 @@
           <w:p>
             <w:pPr>
               <w:pStyle w:val="TableParagraph"/>
-              <w:rPr>
-                <w:rFonts w:ascii="Times New Roman" w:hAnsi="Times New Roman" w:cs="Times New Roman"/>
-              </w:rPr>
-            </w:pPr>
+              <w:jc w:val="center"/>
+              <w:rPr>
+                <w:rFonts w:ascii="Times New Roman" w:hAnsi="Times New Roman" w:cs="Times New Roman"/>
+              </w:rPr>
+            </w:pPr>
+            <w:r>
+              <w:rPr>
+                <w:rFonts w:ascii="Calibri"/>
+                <w:spacing w:val="-2"/>
+              </w:rPr>
+              <w:t>22-01-</w:t>
+            </w:r>
+            <w:r>
+              <w:rPr>
+                <w:rFonts w:ascii="Calibri"/>
+                <w:spacing w:val="-4"/>
+              </w:rPr>
+              <w:t>2026</w:t>
+            </w:r>
           </w:p>
         </w:tc>
         <w:tc>
@@ -11961,10 +12164,25 @@
           <w:p>
             <w:pPr>
               <w:pStyle w:val="TableParagraph"/>
-              <w:rPr>
-                <w:rFonts w:ascii="Times New Roman" w:hAnsi="Times New Roman" w:cs="Times New Roman"/>
-              </w:rPr>
-            </w:pPr>
+              <w:jc w:val="center"/>
+              <w:rPr>
+                <w:rFonts w:ascii="Times New Roman" w:hAnsi="Times New Roman" w:cs="Times New Roman"/>
+              </w:rPr>
+            </w:pPr>
+            <w:r>
+              <w:rPr>
+                <w:rFonts w:ascii="Calibri"/>
+                <w:spacing w:val="-2"/>
+              </w:rPr>
+              <w:t>23-01-</w:t>
+            </w:r>
+            <w:r>
+              <w:rPr>
+                <w:rFonts w:ascii="Calibri"/>
+                <w:spacing w:val="-4"/>
+              </w:rPr>
+              <w:t>2026</w:t>
+            </w:r>
           </w:p>
         </w:tc>
         <w:tc>
@@ -11974,10 +12192,25 @@
           <w:p>
             <w:pPr>
               <w:pStyle w:val="TableParagraph"/>
-              <w:rPr>
-                <w:rFonts w:ascii="Times New Roman" w:hAnsi="Times New Roman" w:cs="Times New Roman"/>
-              </w:rPr>
-            </w:pPr>
+              <w:jc w:val="center"/>
+              <w:rPr>
+                <w:rFonts w:ascii="Times New Roman" w:hAnsi="Times New Roman" w:cs="Times New Roman"/>
+              </w:rPr>
+            </w:pPr>
+            <w:r>
+              <w:rPr>
+                <w:rFonts w:ascii="Calibri"/>
+                <w:spacing w:val="-2"/>
+              </w:rPr>
+              <w:t>24-01-</w:t>
+            </w:r>
+            <w:r>
+              <w:rPr>
+                <w:rFonts w:ascii="Calibri"/>
+                <w:spacing w:val="-4"/>
+              </w:rPr>
+              <w:t>2026</w:t>
+            </w:r>
           </w:p>
         </w:tc>
       </w:tr>
@@ -12010,10 +12243,19 @@
           <w:p>
             <w:pPr>
               <w:pStyle w:val="TableParagraph"/>
-              <w:rPr>
-                <w:rFonts w:ascii="Times New Roman" w:hAnsi="Times New Roman" w:cs="Times New Roman"/>
-              </w:rPr>
-            </w:pPr>
+              <w:jc w:val="center"/>
+              <w:rPr>
+                <w:rFonts w:ascii="Times New Roman" w:hAnsi="Times New Roman" w:cs="Times New Roman"/>
+              </w:rPr>
+            </w:pPr>
+            <w:r>
+              <w:rPr>
+                <w:rFonts w:ascii="Calibri"/>
+                <w:color w:val="AEAAAA"/>
+                <w:spacing w:val="-2"/>
+              </w:rPr>
+              <w:t>(Sign)</w:t>
+            </w:r>
           </w:p>
         </w:tc>
         <w:tc>
@@ -12023,10 +12265,19 @@
           <w:p>
             <w:pPr>
               <w:pStyle w:val="TableParagraph"/>
-              <w:rPr>
-                <w:rFonts w:ascii="Times New Roman" w:hAnsi="Times New Roman" w:cs="Times New Roman"/>
-              </w:rPr>
-            </w:pPr>
+              <w:jc w:val="center"/>
+              <w:rPr>
+                <w:rFonts w:ascii="Times New Roman" w:hAnsi="Times New Roman" w:cs="Times New Roman"/>
+              </w:rPr>
+            </w:pPr>
+            <w:r>
+              <w:rPr>
+                <w:rFonts w:ascii="Calibri"/>
+                <w:color w:val="AEAAAA"/>
+                <w:spacing w:val="-2"/>
+              </w:rPr>
+              <w:t>(Sign)</w:t>
+            </w:r>
           </w:p>
         </w:tc>
         <w:tc>
@@ -12037,10 +12288,19 @@
           <w:p>
             <w:pPr>
               <w:pStyle w:val="TableParagraph"/>
-              <w:rPr>
-                <w:rFonts w:ascii="Times New Roman" w:hAnsi="Times New Roman" w:cs="Times New Roman"/>
-              </w:rPr>
-            </w:pPr>
+              <w:jc w:val="center"/>
+              <w:rPr>
+                <w:rFonts w:ascii="Times New Roman" w:hAnsi="Times New Roman" w:cs="Times New Roman"/>
+              </w:rPr>
+            </w:pPr>
+            <w:r>
+              <w:rPr>
+                <w:rFonts w:ascii="Calibri"/>
+                <w:color w:val="AEAAAA"/>
+                <w:spacing w:val="-2"/>
+              </w:rPr>
+              <w:t>(Sign)</w:t>
+            </w:r>
           </w:p>
         </w:tc>
         <w:tc>
@@ -12050,10 +12310,19 @@
           <w:p>
             <w:pPr>
               <w:pStyle w:val="TableParagraph"/>
-              <w:rPr>
-                <w:rFonts w:ascii="Times New Roman" w:hAnsi="Times New Roman" w:cs="Times New Roman"/>
-              </w:rPr>
-            </w:pPr>
+              <w:jc w:val="center"/>
+              <w:rPr>
+                <w:rFonts w:ascii="Times New Roman" w:hAnsi="Times New Roman" w:cs="Times New Roman"/>
+              </w:rPr>
+            </w:pPr>
+            <w:r>
+              <w:rPr>
+                <w:rFonts w:ascii="Calibri"/>
+                <w:color w:val="AEAAAA"/>
+                <w:spacing w:val="-2"/>
+              </w:rPr>
+              <w:t>(Sign)</w:t>
+            </w:r>
           </w:p>
         </w:tc>
         <w:tc>
@@ -12063,10 +12332,19 @@
           <w:p>
             <w:pPr>
               <w:pStyle w:val="TableParagraph"/>
-              <w:rPr>
-                <w:rFonts w:ascii="Times New Roman" w:hAnsi="Times New Roman" w:cs="Times New Roman"/>
-              </w:rPr>
-            </w:pPr>
+              <w:jc w:val="center"/>
+              <w:rPr>
+                <w:rFonts w:ascii="Times New Roman" w:hAnsi="Times New Roman" w:cs="Times New Roman"/>
+              </w:rPr>
+            </w:pPr>
+            <w:r>
+              <w:rPr>
+                <w:rFonts w:ascii="Calibri"/>
+                <w:color w:val="AEAAAA"/>
+                <w:spacing w:val="-2"/>
+              </w:rPr>
+              <w:t>(Sign)</w:t>
+            </w:r>
           </w:p>
         </w:tc>
         <w:tc>
@@ -12076,10 +12354,19 @@
           <w:p>
             <w:pPr>
               <w:pStyle w:val="TableParagraph"/>
-              <w:rPr>
-                <w:rFonts w:ascii="Times New Roman" w:hAnsi="Times New Roman" w:cs="Times New Roman"/>
-              </w:rPr>
-            </w:pPr>
+              <w:jc w:val="center"/>
+              <w:rPr>
+                <w:rFonts w:ascii="Times New Roman" w:hAnsi="Times New Roman" w:cs="Times New Roman"/>
+              </w:rPr>
+            </w:pPr>
+            <w:r>
+              <w:rPr>
+                <w:rFonts w:ascii="Calibri"/>
+                <w:color w:val="AEAAAA"/>
+                <w:spacing w:val="-2"/>
+              </w:rPr>
+              <w:t>(Sign)</w:t>
+            </w:r>
           </w:p>
         </w:tc>
       </w:tr>
@@ -12120,10 +12407,25 @@
           <w:p>
             <w:pPr>
               <w:pStyle w:val="TableParagraph"/>
-              <w:rPr>
-                <w:rFonts w:ascii="Times New Roman" w:hAnsi="Times New Roman" w:cs="Times New Roman"/>
-              </w:rPr>
-            </w:pPr>
+              <w:jc w:val="center"/>
+              <w:rPr>
+                <w:rFonts w:ascii="Times New Roman" w:hAnsi="Times New Roman" w:cs="Times New Roman"/>
+              </w:rPr>
+            </w:pPr>
+            <w:r>
+              <w:rPr>
+                <w:rFonts w:ascii="Calibri"/>
+                <w:spacing w:val="-2"/>
+              </w:rPr>
+              <w:t>26-01-</w:t>
+            </w:r>
+            <w:r>
+              <w:rPr>
+                <w:rFonts w:ascii="Calibri"/>
+                <w:spacing w:val="-4"/>
+              </w:rPr>
+              <w:t>2026</w:t>
+            </w:r>
           </w:p>
         </w:tc>
         <w:tc>
@@ -12133,10 +12435,25 @@
           <w:p>
             <w:pPr>
               <w:pStyle w:val="TableParagraph"/>
-              <w:rPr>
-                <w:rFonts w:ascii="Times New Roman" w:hAnsi="Times New Roman" w:cs="Times New Roman"/>
-              </w:rPr>
-            </w:pPr>
+              <w:jc w:val="center"/>
+              <w:rPr>
+                <w:rFonts w:ascii="Times New Roman" w:hAnsi="Times New Roman" w:cs="Times New Roman"/>
+              </w:rPr>
+            </w:pPr>
+            <w:r>
+              <w:rPr>
+                <w:rFonts w:ascii="Calibri"/>
+                <w:spacing w:val="-2"/>
+              </w:rPr>
+              <w:t>27-01-</w:t>
+            </w:r>
+            <w:r>
+              <w:rPr>
+                <w:rFonts w:ascii="Calibri"/>
+                <w:spacing w:val="-4"/>
+              </w:rPr>
+              <w:t>2026</w:t>
+            </w:r>
           </w:p>
         </w:tc>
         <w:tc>
@@ -12147,10 +12464,25 @@
           <w:p>
             <w:pPr>
               <w:pStyle w:val="TableParagraph"/>
-              <w:rPr>
-                <w:rFonts w:ascii="Times New Roman" w:hAnsi="Times New Roman" w:cs="Times New Roman"/>
-              </w:rPr>
-            </w:pPr>
+              <w:jc w:val="center"/>
+              <w:rPr>
+                <w:rFonts w:ascii="Times New Roman" w:hAnsi="Times New Roman" w:cs="Times New Roman"/>
+              </w:rPr>
+            </w:pPr>
+            <w:r>
+              <w:rPr>
+                <w:rFonts w:ascii="Calibri"/>
+                <w:spacing w:val="-2"/>
+              </w:rPr>
+              <w:t>28-01-</w:t>
+            </w:r>
+            <w:r>
+              <w:rPr>
+                <w:rFonts w:ascii="Calibri"/>
+                <w:spacing w:val="-4"/>
+              </w:rPr>
+              <w:t>2026</w:t>
+            </w:r>
           </w:p>
         </w:tc>
         <w:tc>
@@ -12160,10 +12492,25 @@
           <w:p>
             <w:pPr>
               <w:pStyle w:val="TableParagraph"/>
-              <w:rPr>
-                <w:rFonts w:ascii="Times New Roman" w:hAnsi="Times New Roman" w:cs="Times New Roman"/>
-              </w:rPr>
-            </w:pPr>
+              <w:jc w:val="center"/>
+              <w:rPr>
+                <w:rFonts w:ascii="Times New Roman" w:hAnsi="Times New Roman" w:cs="Times New Roman"/>
+              </w:rPr>
+            </w:pPr>
+            <w:r>
+              <w:rPr>
+                <w:rFonts w:ascii="Calibri"/>
+                <w:spacing w:val="-2"/>
+              </w:rPr>
+              <w:t>29-01-</w:t>
+            </w:r>
+            <w:r>
+              <w:rPr>
+                <w:rFonts w:ascii="Calibri"/>
+                <w:spacing w:val="-4"/>
+              </w:rPr>
+              <w:t>2026</w:t>
+            </w:r>
           </w:p>
         </w:tc>
         <w:tc>
@@ -12173,10 +12520,25 @@
           <w:p>
             <w:pPr>
               <w:pStyle w:val="TableParagraph"/>
-              <w:rPr>
-                <w:rFonts w:ascii="Times New Roman" w:hAnsi="Times New Roman" w:cs="Times New Roman"/>
-              </w:rPr>
-            </w:pPr>
+              <w:jc w:val="center"/>
+              <w:rPr>
+                <w:rFonts w:ascii="Times New Roman" w:hAnsi="Times New Roman" w:cs="Times New Roman"/>
+              </w:rPr>
+            </w:pPr>
+            <w:r>
+              <w:rPr>
+                <w:rFonts w:ascii="Calibri"/>
+                <w:spacing w:val="-2"/>
+              </w:rPr>
+              <w:t>30-01-</w:t>
+            </w:r>
+            <w:r>
+              <w:rPr>
+                <w:rFonts w:ascii="Calibri"/>
+                <w:spacing w:val="-4"/>
+              </w:rPr>
+              <w:t>2026</w:t>
+            </w:r>
           </w:p>
         </w:tc>
         <w:tc>
@@ -12186,10 +12548,25 @@
           <w:p>
             <w:pPr>
               <w:pStyle w:val="TableParagraph"/>
-              <w:rPr>
-                <w:rFonts w:ascii="Times New Roman" w:hAnsi="Times New Roman" w:cs="Times New Roman"/>
-              </w:rPr>
-            </w:pPr>
+              <w:jc w:val="center"/>
+              <w:rPr>
+                <w:rFonts w:ascii="Times New Roman" w:hAnsi="Times New Roman" w:cs="Times New Roman"/>
+              </w:rPr>
+            </w:pPr>
+            <w:r>
+              <w:rPr>
+                <w:rFonts w:ascii="Calibri"/>
+                <w:spacing w:val="-2"/>
+              </w:rPr>
+              <w:t>31-01-</w:t>
+            </w:r>
+            <w:r>
+              <w:rPr>
+                <w:rFonts w:ascii="Calibri"/>
+                <w:spacing w:val="-4"/>
+              </w:rPr>
+              <w:t>2026</w:t>
+            </w:r>
           </w:p>
         </w:tc>
       </w:tr>
@@ -12222,10 +12599,19 @@
           <w:p>
             <w:pPr>
               <w:pStyle w:val="TableParagraph"/>
-              <w:rPr>
-                <w:rFonts w:ascii="Times New Roman" w:hAnsi="Times New Roman" w:cs="Times New Roman"/>
-              </w:rPr>
-            </w:pPr>
+              <w:jc w:val="center"/>
+              <w:rPr>
+                <w:rFonts w:ascii="Times New Roman" w:hAnsi="Times New Roman" w:cs="Times New Roman"/>
+              </w:rPr>
+            </w:pPr>
+            <w:r>
+              <w:rPr>
+                <w:rFonts w:ascii="Calibri"/>
+                <w:color w:val="AEAAAA"/>
+                <w:spacing w:val="-2"/>
+              </w:rPr>
+              <w:t>(Sign)</w:t>
+            </w:r>
           </w:p>
         </w:tc>
         <w:tc>
@@ -12235,10 +12621,19 @@
           <w:p>
             <w:pPr>
               <w:pStyle w:val="TableParagraph"/>
-              <w:rPr>
-                <w:rFonts w:ascii="Times New Roman" w:hAnsi="Times New Roman" w:cs="Times New Roman"/>
-              </w:rPr>
-            </w:pPr>
+              <w:jc w:val="center"/>
+              <w:rPr>
+                <w:rFonts w:ascii="Times New Roman" w:hAnsi="Times New Roman" w:cs="Times New Roman"/>
+              </w:rPr>
+            </w:pPr>
+            <w:r>
+              <w:rPr>
+                <w:rFonts w:ascii="Calibri"/>
+                <w:color w:val="AEAAAA"/>
+                <w:spacing w:val="-2"/>
+              </w:rPr>
+              <w:t>(Sign)</w:t>
+            </w:r>
           </w:p>
         </w:tc>
         <w:tc>
@@ -12249,10 +12644,19 @@
           <w:p>
             <w:pPr>
               <w:pStyle w:val="TableParagraph"/>
-              <w:rPr>
-                <w:rFonts w:ascii="Times New Roman" w:hAnsi="Times New Roman" w:cs="Times New Roman"/>
-              </w:rPr>
-            </w:pPr>
+              <w:jc w:val="center"/>
+              <w:rPr>
+                <w:rFonts w:ascii="Times New Roman" w:hAnsi="Times New Roman" w:cs="Times New Roman"/>
+              </w:rPr>
+            </w:pPr>
+            <w:r>
+              <w:rPr>
+                <w:rFonts w:ascii="Calibri"/>
+                <w:color w:val="AEAAAA"/>
+                <w:spacing w:val="-2"/>
+              </w:rPr>
+              <w:t>(Sign)</w:t>
+            </w:r>
           </w:p>
         </w:tc>
         <w:tc>
@@ -12262,10 +12666,19 @@
           <w:p>
             <w:pPr>
               <w:pStyle w:val="TableParagraph"/>
-              <w:rPr>
-                <w:rFonts w:ascii="Times New Roman" w:hAnsi="Times New Roman" w:cs="Times New Roman"/>
-              </w:rPr>
-            </w:pPr>
+              <w:jc w:val="center"/>
+              <w:rPr>
+                <w:rFonts w:ascii="Times New Roman" w:hAnsi="Times New Roman" w:cs="Times New Roman"/>
+              </w:rPr>
+            </w:pPr>
+            <w:r>
+              <w:rPr>
+                <w:rFonts w:ascii="Calibri"/>
+                <w:color w:val="AEAAAA"/>
+                <w:spacing w:val="-2"/>
+              </w:rPr>
+              <w:t>(Sign)</w:t>
+            </w:r>
           </w:p>
         </w:tc>
         <w:tc>
@@ -12275,10 +12688,19 @@
           <w:p>
             <w:pPr>
               <w:pStyle w:val="TableParagraph"/>
-              <w:rPr>
-                <w:rFonts w:ascii="Times New Roman" w:hAnsi="Times New Roman" w:cs="Times New Roman"/>
-              </w:rPr>
-            </w:pPr>
+              <w:jc w:val="center"/>
+              <w:rPr>
+                <w:rFonts w:ascii="Times New Roman" w:hAnsi="Times New Roman" w:cs="Times New Roman"/>
+              </w:rPr>
+            </w:pPr>
+            <w:r>
+              <w:rPr>
+                <w:rFonts w:ascii="Calibri"/>
+                <w:color w:val="AEAAAA"/>
+                <w:spacing w:val="-2"/>
+              </w:rPr>
+              <w:t>(Sign)</w:t>
+            </w:r>
           </w:p>
         </w:tc>
         <w:tc>
@@ -12288,10 +12710,19 @@
           <w:p>
             <w:pPr>
               <w:pStyle w:val="TableParagraph"/>
-              <w:rPr>
-                <w:rFonts w:ascii="Times New Roman" w:hAnsi="Times New Roman" w:cs="Times New Roman"/>
-              </w:rPr>
-            </w:pPr>
+              <w:jc w:val="center"/>
+              <w:rPr>
+                <w:rFonts w:ascii="Times New Roman" w:hAnsi="Times New Roman" w:cs="Times New Roman"/>
+              </w:rPr>
+            </w:pPr>
+            <w:r>
+              <w:rPr>
+                <w:rFonts w:ascii="Calibri"/>
+                <w:color w:val="AEAAAA"/>
+                <w:spacing w:val="-2"/>
+              </w:rPr>
+              <w:t>(Sign)</w:t>
+            </w:r>
           </w:p>
         </w:tc>
       </w:tr>
@@ -13664,10 +14095,10 @@
           <w:sz w:val="20"/>
         </w:rPr>
         <w:drawing>
-          <wp:inline distT="0" distB="0" distL="0" distR="0" wp14:anchorId="18A8239A" wp14:editId="32D3D352">
-            <wp:extent cx="5905500" cy="5899150"/>
-            <wp:effectExtent l="0" t="0" r="0" b="6350"/>
-            <wp:docPr id="664285739" name="Picture 14"/>
+          <wp:inline distT="0" distB="0" distL="0" distR="0" wp14:anchorId="1FD4127C" wp14:editId="5FE11511">
+            <wp:extent cx="6033135" cy="7823200"/>
+            <wp:effectExtent l="0" t="0" r="5715" b="6350"/>
+            <wp:docPr id="330199397" name="Picture 7"/>
             <wp:cNvGraphicFramePr>
               <a:graphicFrameLocks xmlns:a="http://schemas.openxmlformats.org/drawingml/2006/main" noChangeAspect="1"/>
             </wp:cNvGraphicFramePr>
@@ -13675,17 +14106,11 @@
               <a:graphicData uri="http://schemas.openxmlformats.org/drawingml/2006/picture">
                 <pic:pic xmlns:pic="http://schemas.openxmlformats.org/drawingml/2006/picture">
                   <pic:nvPicPr>
-                    <pic:cNvPr id="664285739" name="Picture 664285739"/>
+                    <pic:cNvPr id="330199397" name="Picture 330199397"/>
                     <pic:cNvPicPr/>
                   </pic:nvPicPr>
                   <pic:blipFill>
-                    <a:blip r:embed="rId11">
-                      <a:extLst>
-                        <a:ext uri="{28A0092B-C50C-407E-A947-70E740481C1C}">
-                          <a14:useLocalDpi xmlns:a14="http://schemas.microsoft.com/office/drawing/2010/main" val="0"/>
-                        </a:ext>
-                      </a:extLst>
-                    </a:blip>
+                    <a:blip r:embed="rId11"/>
                     <a:stretch>
                       <a:fillRect/>
                     </a:stretch>
@@ -13693,7 +14118,7 @@
                   <pic:spPr>
                     <a:xfrm>
                       <a:off x="0" y="0"/>
-                      <a:ext cx="5905500" cy="5899150"/>
+                      <a:ext cx="6033135" cy="7823200"/>
                     </a:xfrm>
                     <a:prstGeom prst="rect">
                       <a:avLst/>
@@ -14196,7 +14621,29 @@
           <w:sz w:val="24"/>
           <w:szCs w:val="24"/>
         </w:rPr>
-        <w:t xml:space="preserve">            </w:t>
+        <w:t xml:space="preserve">     </w:t>
+      </w:r>
+      <w:r>
+        <w:rPr>
+          <w:rFonts w:ascii="Times New Roman" w:eastAsia="Times New Roman" w:hAnsi="Times New Roman" w:cs="Times New Roman"/>
+          <w:b/>
+          <w:bCs/>
+          <w:color w:val="467785"/>
+          <w:sz w:val="24"/>
+          <w:szCs w:val="24"/>
+        </w:rPr>
+        <w:t xml:space="preserve"> </w:t>
+      </w:r>
+      <w:r>
+        <w:rPr>
+          <w:rFonts w:ascii="Times New Roman" w:eastAsia="Times New Roman" w:hAnsi="Times New Roman" w:cs="Times New Roman"/>
+          <w:b/>
+          <w:bCs/>
+          <w:color w:val="467785"/>
+          <w:sz w:val="24"/>
+          <w:szCs w:val="24"/>
+        </w:rPr>
+        <w:t xml:space="preserve">  </w:t>
       </w:r>
       <w:r>
         <w:rPr>
@@ -14206,7 +14653,17 @@
           <w:sz w:val="24"/>
           <w:szCs w:val="24"/>
         </w:rPr>
-        <w:t xml:space="preserve">OJT </w:t>
+        <w:t>OJT</w:t>
+      </w:r>
+      <w:r>
+        <w:rPr>
+          <w:rFonts w:ascii="Times New Roman" w:eastAsia="Times New Roman" w:hAnsi="Times New Roman" w:cs="Times New Roman"/>
+          <w:b/>
+          <w:bCs/>
+          <w:sz w:val="24"/>
+          <w:szCs w:val="24"/>
+        </w:rPr>
+        <w:t xml:space="preserve"> </w:t>
       </w:r>
       <w:proofErr w:type="gramStart"/>
       <w:r>
@@ -14405,16 +14862,14 @@
         </w:rPr>
         <w:t xml:space="preserve"> </w:t>
       </w:r>
-      <w:proofErr w:type="spellStart"/>
       <w:r>
         <w:rPr>
           <w:rFonts w:ascii="Times New Roman" w:hAnsi="Times New Roman" w:cs="Times New Roman"/>
           <w:sz w:val="24"/>
           <w:u w:val="single"/>
         </w:rPr>
-        <w:t>Maharastra</w:t>
-      </w:r>
-      <w:proofErr w:type="spellEnd"/>
+        <w:t>Maharashtra</w:t>
+      </w:r>
     </w:p>
     <w:p>
       <w:pPr>
@@ -14605,49 +15060,7 @@
           <w:sz w:val="24"/>
           <w:u w:val="single"/>
         </w:rPr>
-        <w:t>20/01/2026</w:t>
-      </w:r>
-      <w:r>
-        <w:rPr>
-          <w:rFonts w:ascii="Times New Roman" w:hAnsi="Times New Roman" w:cs="Times New Roman"/>
-          <w:spacing w:val="-7"/>
-          <w:sz w:val="24"/>
-        </w:rPr>
-        <w:t xml:space="preserve"> </w:t>
-      </w:r>
-      <w:proofErr w:type="gramStart"/>
-      <w:r>
-        <w:rPr>
-          <w:rFonts w:ascii="Times New Roman" w:hAnsi="Times New Roman" w:cs="Times New Roman"/>
-          <w:spacing w:val="-6"/>
-          <w:sz w:val="24"/>
-        </w:rPr>
-        <w:t>To</w:t>
-      </w:r>
-      <w:r>
-        <w:rPr>
-          <w:rFonts w:ascii="Times New Roman" w:hAnsi="Times New Roman" w:cs="Times New Roman"/>
-          <w:spacing w:val="-3"/>
-          <w:sz w:val="24"/>
-        </w:rPr>
-        <w:t xml:space="preserve"> </w:t>
-      </w:r>
-      <w:r>
-        <w:rPr>
-          <w:rFonts w:ascii="Times New Roman" w:hAnsi="Times New Roman" w:cs="Times New Roman"/>
-          <w:spacing w:val="-6"/>
-          <w:sz w:val="24"/>
-        </w:rPr>
-        <w:t>:</w:t>
-      </w:r>
-      <w:proofErr w:type="gramEnd"/>
-      <w:r>
-        <w:rPr>
-          <w:rFonts w:ascii="Times New Roman" w:hAnsi="Times New Roman" w:cs="Times New Roman"/>
-          <w:spacing w:val="-3"/>
-          <w:sz w:val="24"/>
-        </w:rPr>
-        <w:t xml:space="preserve"> </w:t>
+        <w:t>20/</w:t>
       </w:r>
       <w:r>
         <w:rPr>
@@ -14656,7 +15069,96 @@
           <w:sz w:val="24"/>
           <w:u w:val="single"/>
         </w:rPr>
-        <w:t>23/03/2026</w:t>
+        <w:t>12</w:t>
+      </w:r>
+      <w:r>
+        <w:rPr>
+          <w:rFonts w:ascii="Times New Roman" w:hAnsi="Times New Roman" w:cs="Times New Roman"/>
+          <w:spacing w:val="-6"/>
+          <w:sz w:val="24"/>
+          <w:u w:val="single"/>
+        </w:rPr>
+        <w:t>/202</w:t>
+      </w:r>
+      <w:r>
+        <w:rPr>
+          <w:rFonts w:ascii="Times New Roman" w:hAnsi="Times New Roman" w:cs="Times New Roman"/>
+          <w:spacing w:val="-6"/>
+          <w:sz w:val="24"/>
+          <w:u w:val="single"/>
+        </w:rPr>
+        <w:t>5</w:t>
+      </w:r>
+      <w:r>
+        <w:rPr>
+          <w:rFonts w:ascii="Times New Roman" w:hAnsi="Times New Roman" w:cs="Times New Roman"/>
+          <w:spacing w:val="-7"/>
+          <w:sz w:val="24"/>
+        </w:rPr>
+        <w:t xml:space="preserve"> </w:t>
+      </w:r>
+      <w:proofErr w:type="gramStart"/>
+      <w:r>
+        <w:rPr>
+          <w:rFonts w:ascii="Times New Roman" w:hAnsi="Times New Roman" w:cs="Times New Roman"/>
+          <w:b/>
+          <w:bCs/>
+          <w:spacing w:val="-6"/>
+          <w:sz w:val="24"/>
+        </w:rPr>
+        <w:t>To</w:t>
+      </w:r>
+      <w:r>
+        <w:rPr>
+          <w:rFonts w:ascii="Times New Roman" w:hAnsi="Times New Roman" w:cs="Times New Roman"/>
+          <w:spacing w:val="-3"/>
+          <w:sz w:val="24"/>
+        </w:rPr>
+        <w:t xml:space="preserve"> </w:t>
+      </w:r>
+      <w:r>
+        <w:rPr>
+          <w:rFonts w:ascii="Times New Roman" w:hAnsi="Times New Roman" w:cs="Times New Roman"/>
+          <w:spacing w:val="-6"/>
+          <w:sz w:val="24"/>
+        </w:rPr>
+        <w:t>:</w:t>
+      </w:r>
+      <w:proofErr w:type="gramEnd"/>
+      <w:r>
+        <w:rPr>
+          <w:rFonts w:ascii="Times New Roman" w:hAnsi="Times New Roman" w:cs="Times New Roman"/>
+          <w:spacing w:val="-3"/>
+          <w:sz w:val="24"/>
+        </w:rPr>
+        <w:t xml:space="preserve"> </w:t>
+      </w:r>
+      <w:r>
+        <w:rPr>
+          <w:rFonts w:ascii="Times New Roman" w:hAnsi="Times New Roman" w:cs="Times New Roman"/>
+          <w:spacing w:val="-6"/>
+          <w:sz w:val="24"/>
+          <w:u w:val="single"/>
+        </w:rPr>
+        <w:t>2</w:t>
+      </w:r>
+      <w:r>
+        <w:rPr>
+          <w:rFonts w:ascii="Times New Roman" w:hAnsi="Times New Roman" w:cs="Times New Roman"/>
+          <w:spacing w:val="-6"/>
+          <w:sz w:val="24"/>
+          <w:u w:val="single"/>
+        </w:rPr>
+        <w:t>1</w:t>
+      </w:r>
+      <w:r>
+        <w:rPr>
+          <w:rFonts w:ascii="Times New Roman" w:hAnsi="Times New Roman" w:cs="Times New Roman"/>
+          <w:spacing w:val="-6"/>
+          <w:sz w:val="24"/>
+          <w:u w:val="single"/>
+        </w:rPr>
+        <w:t>/03/2026</w:t>
       </w:r>
     </w:p>
     <w:p>
@@ -21143,15 +21645,7 @@
                               <w:b/>
                               <w:sz w:val="24"/>
                             </w:rPr>
-                            <w:t>Seat</w:t>
-                          </w:r>
-                          <w:r>
-                            <w:rPr>
-                              <w:rFonts w:ascii="Times New Roman"/>
-                              <w:b/>
-                              <w:sz w:val="24"/>
-                            </w:rPr>
-                            <w:t xml:space="preserve"> No. </w:t>
+                            <w:t xml:space="preserve">Seat No. </w:t>
                           </w:r>
                           <w:r>
                             <w:rPr>
@@ -23150,7 +23644,6 @@
   <w:style w:type="character" w:default="1" w:styleId="DefaultParagraphFont">
     <w:name w:val="Default Paragraph Font"/>
     <w:uiPriority w:val="1"/>
-    <w:semiHidden/>
     <w:unhideWhenUsed/>
   </w:style>
   <w:style w:type="table" w:default="1" w:styleId="TableNormal">

</xml_diff>